<commit_message>
Re-export all three cheat sheets, each back to two pages
Rebuilt the Word documents and PDFs so they carry the current attribution
block. All three now hold to the two-page limit the skill requires.

Co-Authored-By: Claude Opus 5 <noreply@anthropic.com>
</commit_message>
<xml_diff>
--- a/cheatsheets/Speak_Before_the_Reveal_General_Medicine.docx
+++ b/cheatsheets/Speak_Before_the_Reveal_General_Medicine.docx
@@ -105,27 +105,7 @@
           <w:i/>
           <w:color w:val="943634" w:themeColor="accent2" w:themeShade="BF"/>
         </w:rPr>
-        <w:t xml:space="preserve">requires </w:t>
-      </w:r>
-      <w:r>
-        <w:rPr>
-          <w:rFonts w:cs="Cambria"/>
-          <w:b/>
-          <w:bCs/>
-          <w:i/>
-          <w:color w:val="943634" w:themeColor="accent2" w:themeShade="BF"/>
-        </w:rPr>
-        <w:t>physician</w:t>
-      </w:r>
-      <w:r>
-        <w:rPr>
-          <w:rFonts w:cs="Cambria"/>
-          <w:b/>
-          <w:bCs/>
-          <w:i/>
-          <w:color w:val="943634" w:themeColor="accent2" w:themeShade="BF"/>
-        </w:rPr>
-        <w:t xml:space="preserve"> review</w:t>
+        <w:t>requires physician review</w:t>
       </w:r>
       <w:r>
         <w:rPr>
@@ -174,13 +154,7 @@
         <w:rPr>
           <w:rFonts w:cs="Cambria"/>
         </w:rPr>
-        <w:t>Speak your reasoning aloud while the scribe is still recording, so that your examination, interpretation and plan — not the AI’s reconstruction — anchor the record. Step away from the bedside, dictate the prompts below, and only then stop the recording. Work through them for each patient and skip what does not apply. The scribe reliably captures what was said in the room: the history, the results and observations you read out, the instructions you gave. It cannot capture what you saw, felt, heard, or decide</w:t>
-      </w:r>
-      <w:r>
-        <w:rPr>
-          <w:rFonts w:cs="Cambria"/>
-        </w:rPr>
-        <w:t>d in silence. Those are the items below.</w:t>
+        <w:t>Speak your reasoning aloud while the scribe is still recording, so that your examination, interpretation and plan — not the AI’s reconstruction — anchor the record. Step away from the bedside, dictate the prompts below, and only then stop the recording. Work through them for each patient and skip what does not apply. The scribe reliably captures what was said in the room: the history, the results and observations you read out, the instructions you gave. It cannot capture what you saw, felt, heard, or decided in silence. Those are the items below.</w:t>
       </w:r>
     </w:p>
     <w:p>
@@ -1162,7 +1136,6 @@
           <w:b/>
           <w:color w:val="0B4F4F"/>
         </w:rPr>
-        <w:lastRenderedPageBreak/>
         <w:t xml:space="preserve">Consider  </w:t>
       </w:r>
       <w:r>
@@ -1183,6 +1156,7 @@
           <w:color w:val="0B4F4F"/>
           <w:sz w:val="16"/>
         </w:rPr>
+        <w:lastRenderedPageBreak/>
         <w:t xml:space="preserve">Preserves: </w:t>
       </w:r>
       <w:r>
@@ -2173,8 +2147,25 @@
           <w:i/>
           <w:sz w:val="16"/>
         </w:rPr>
-        <w:lastRenderedPageBreak/>
-        <w:t>Clinical content selected and verified by: ________________________     Date: ______________</w:t>
+        <w:t xml:space="preserve">Clinical content selected and verified </w:t>
+      </w:r>
+      <w:proofErr w:type="gramStart"/>
+      <w:r>
+        <w:rPr>
+          <w:rFonts w:cs="Cambria"/>
+          <w:i/>
+          <w:sz w:val="16"/>
+        </w:rPr>
+        <w:t>by: _</w:t>
+      </w:r>
+      <w:proofErr w:type="gramEnd"/>
+      <w:r>
+        <w:rPr>
+          <w:rFonts w:cs="Cambria"/>
+          <w:i/>
+          <w:sz w:val="16"/>
+        </w:rPr>
+        <w:t>_______________________     Date: ______________</w:t>
       </w:r>
     </w:p>
     <w:p>
@@ -2195,6 +2186,7 @@
       <w:pgSz w:w="11906" w:h="16838"/>
       <w:pgMar w:top="595" w:right="595" w:bottom="595" w:left="595" w:header="720" w:footer="340" w:gutter="0"/>
       <w:cols w:space="720"/>
+      <w:titlePg/>
       <w:docGrid w:linePitch="360"/>
     </w:sectPr>
   </w:body>

</xml_diff>